<commit_message>
YHAAO-2264 support dynamic columns.
</commit_message>
<xml_diff>
--- a/src/src/main/webapp/portal/asset/template/tobeterminated_template.docx
+++ b/src/src/main/webapp/portal/asset/template/tobeterminated_template.docx
@@ -18,9 +18,6 @@
     <w:p>
       <w:pPr>
         <w:spacing w:after="20"/>
-        <w:rPr>
-          <w:rFonts w:hint="eastAsia"/>
-        </w:rPr>
       </w:pPr>
       <w:r>
         <w:rPr>
@@ -69,12 +66,12 @@
         <w:tblLook w:val="04A0" w:firstRow="1" w:lastRow="0" w:firstColumn="1" w:lastColumn="0" w:noHBand="0" w:noVBand="1"/>
       </w:tblPr>
       <w:tblGrid>
-        <w:gridCol w:w="1440"/>
-        <w:gridCol w:w="1439"/>
-        <w:gridCol w:w="1439"/>
-        <w:gridCol w:w="1439"/>
-        <w:gridCol w:w="1439"/>
-        <w:gridCol w:w="1439"/>
+        <w:gridCol w:w="1662"/>
+        <w:gridCol w:w="1427"/>
+        <w:gridCol w:w="1128"/>
+        <w:gridCol w:w="1391"/>
+        <w:gridCol w:w="1591"/>
+        <w:gridCol w:w="1436"/>
       </w:tblGrid>
       <w:tr>
         <w:tc>
@@ -100,9 +97,6 @@
           <w:p>
             <w:pPr>
               <w:jc w:val="center"/>
-              <w:rPr>
-                <w:rFonts w:hint="eastAsia"/>
-              </w:rPr>
             </w:pPr>
             <w:r>
               <w:rPr>
@@ -135,9 +129,6 @@
           <w:p>
             <w:pPr>
               <w:jc w:val="center"/>
-              <w:rPr>
-                <w:rFonts w:hint="eastAsia"/>
-              </w:rPr>
             </w:pPr>
             <w:r>
               <w:rPr>
@@ -184,37 +175,112 @@
         <w:tc>
           <w:tcPr>
             <w:tcW w:w="2880" w:type="dxa"/>
-            <w:gridSpan w:val="6"/>
-          </w:tcPr>
-          <w:p>
-            <w:pPr>
-              <w:rPr>
-                <w:rFonts w:hint="eastAsia"/>
-              </w:rPr>
-            </w:pPr>
-            <w:r>
-              <w:rPr>
-                <w:rFonts w:hint="eastAsia"/>
-              </w:rPr>
-              <w:t>{</w:t>
-            </w:r>
-            <w:r>
-              <w:t>{</w:t>
-            </w:r>
-            <w:r>
-              <w:t>asset_detail</w:t>
+          </w:tcPr>
+          <w:p>
+            <w:pPr>
+              <w:jc w:val="center"/>
+              <w:rPr>
+                <w:rFonts w:hint="eastAsia"/>
+              </w:rPr>
+            </w:pPr>
+            <w:proofErr w:type="spellStart"/>
+            <w:r>
+              <w:t>financing_num</w:t>
+            </w:r>
+            <w:proofErr w:type="spellEnd"/>
+          </w:p>
+        </w:tc>
+        <w:tc>
+          <w:tcPr>
+            <w:tcW w:w="2880" w:type="dxa"/>
+          </w:tcPr>
+          <w:p>
+            <w:pPr>
+              <w:jc w:val="center"/>
+              <w:rPr>
+                <w:rFonts w:hint="eastAsia"/>
+              </w:rPr>
+            </w:pPr>
+            <w:proofErr w:type="spellStart"/>
+            <w:r>
+              <w:t>asset_name</w:t>
+            </w:r>
+            <w:proofErr w:type="spellEnd"/>
+          </w:p>
+        </w:tc>
+        <w:tc>
+          <w:tcPr>
+            <w:tcW w:w="2880" w:type="dxa"/>
+          </w:tcPr>
+          <w:p>
+            <w:pPr>
+              <w:jc w:val="center"/>
+              <w:rPr>
+                <w:rFonts w:hint="eastAsia"/>
+              </w:rPr>
+            </w:pPr>
+            <w:r>
+              <w:t>quantity</w:t>
+            </w:r>
+          </w:p>
+        </w:tc>
+        <w:tc>
+          <w:tcPr>
+            <w:tcW w:w="2880" w:type="dxa"/>
+          </w:tcPr>
+          <w:p>
+            <w:pPr>
+              <w:jc w:val="center"/>
+              <w:rPr>
+                <w:rFonts w:hint="eastAsia"/>
+              </w:rPr>
+            </w:pPr>
+            <w:proofErr w:type="spellStart"/>
+            <w:r>
+              <w:t>book_value</w:t>
+            </w:r>
+            <w:proofErr w:type="spellEnd"/>
+          </w:p>
+        </w:tc>
+        <w:tc>
+          <w:tcPr>
+            <w:tcW w:w="2880" w:type="dxa"/>
+          </w:tcPr>
+          <w:p>
+            <w:pPr>
+              <w:jc w:val="center"/>
+              <w:rPr>
+                <w:rFonts w:hint="eastAsia"/>
+              </w:rPr>
+            </w:pPr>
+            <w:proofErr w:type="spellStart"/>
+            <w:r>
+              <w:t>function_type</w:t>
+            </w:r>
+            <w:proofErr w:type="spellEnd"/>
+          </w:p>
+        </w:tc>
+        <w:tc>
+          <w:tcPr>
+            <w:tcW w:w="2880" w:type="dxa"/>
+          </w:tcPr>
+          <w:p>
+            <w:pPr>
+              <w:jc w:val="center"/>
+              <w:rPr>
+                <w:rFonts w:hint="eastAsia"/>
+              </w:rPr>
+            </w:pPr>
+            <w:proofErr w:type="spellStart"/>
+            <w:r>
+              <w:t>cre</w:t>
             </w:r>
             <w:bookmarkStart w:id="0" w:name="_GoBack"/>
             <w:bookmarkEnd w:id="0"/>
             <w:r>
-              <w:t>_table}</w:t>
-            </w:r>
-            <w:r>
-              <w:rPr>
-                <w:rFonts w:hint="eastAsia"/>
-              </w:rPr>
-              <w:t>}</w:t>
-            </w:r>
+              <w:t>ate_time</w:t>
+            </w:r>
+            <w:proofErr w:type="spellEnd"/>
           </w:p>
         </w:tc>
       </w:tr>
@@ -222,13 +288,43 @@
         <w:tc>
           <w:tcPr>
             <w:tcW w:w="2880" w:type="dxa"/>
-          </w:tcPr>
-          <w:p>
-            <w:pPr>
-              <w:jc w:val="center"/>
-              <w:rPr>
-                <w:rFonts w:hint="eastAsia"/>
-              </w:rPr>
+            <w:gridSpan w:val="6"/>
+          </w:tcPr>
+          <w:p>
+            <w:r>
+              <w:rPr>
+                <w:rFonts w:hint="eastAsia"/>
+              </w:rPr>
+              <w:t>{</w:t>
+            </w:r>
+            <w:r>
+              <w:t>{</w:t>
+            </w:r>
+            <w:proofErr w:type="spellStart"/>
+            <w:r>
+              <w:t>asset_detail_table</w:t>
+            </w:r>
+            <w:proofErr w:type="spellEnd"/>
+            <w:r>
+              <w:t>}</w:t>
+            </w:r>
+            <w:r>
+              <w:rPr>
+                <w:rFonts w:hint="eastAsia"/>
+              </w:rPr>
+              <w:t>}</w:t>
+            </w:r>
+          </w:p>
+        </w:tc>
+      </w:tr>
+      <w:tr>
+        <w:tc>
+          <w:tcPr>
+            <w:tcW w:w="2880" w:type="dxa"/>
+          </w:tcPr>
+          <w:p>
+            <w:pPr>
+              <w:jc w:val="center"/>
             </w:pPr>
             <w:r>
               <w:rPr>
@@ -245,9 +341,6 @@
           <w:p>
             <w:pPr>
               <w:jc w:val="center"/>
-              <w:rPr>
-                <w:rFonts w:hint="eastAsia"/>
-              </w:rPr>
             </w:pPr>
           </w:p>
         </w:tc>
@@ -274,9 +367,6 @@
           <w:p>
             <w:pPr>
               <w:jc w:val="center"/>
-              <w:rPr>
-                <w:rFonts w:hint="eastAsia"/>
-              </w:rPr>
             </w:pPr>
           </w:p>
         </w:tc>
@@ -318,9 +408,6 @@
           <w:p>
             <w:pPr>
               <w:jc w:val="center"/>
-              <w:rPr>
-                <w:rFonts w:hint="eastAsia"/>
-              </w:rPr>
             </w:pPr>
             <w:r>
               <w:rPr>
@@ -353,9 +440,6 @@
           <w:p>
             <w:pPr>
               <w:jc w:val="center"/>
-              <w:rPr>
-                <w:rFonts w:hint="eastAsia"/>
-              </w:rPr>
             </w:pPr>
             <w:r>
               <w:rPr>
@@ -388,9 +472,6 @@
           <w:p>
             <w:pPr>
               <w:jc w:val="center"/>
-              <w:rPr>
-                <w:rFonts w:hint="eastAsia"/>
-              </w:rPr>
             </w:pPr>
             <w:r>
               <w:rPr>
@@ -423,9 +504,6 @@
           <w:p>
             <w:pPr>
               <w:jc w:val="center"/>
-              <w:rPr>
-                <w:rFonts w:hint="eastAsia"/>
-              </w:rPr>
             </w:pPr>
             <w:r>
               <w:rPr>
@@ -458,9 +536,6 @@
           <w:p>
             <w:pPr>
               <w:jc w:val="center"/>
-              <w:rPr>
-                <w:rFonts w:hint="eastAsia"/>
-              </w:rPr>
             </w:pPr>
             <w:r>
               <w:rPr>
@@ -493,9 +568,6 @@
           <w:p>
             <w:pPr>
               <w:jc w:val="center"/>
-              <w:rPr>
-                <w:rFonts w:hint="eastAsia"/>
-              </w:rPr>
             </w:pPr>
             <w:r>
               <w:rPr>
@@ -528,9 +600,6 @@
           <w:p>
             <w:pPr>
               <w:jc w:val="center"/>
-              <w:rPr>
-                <w:rFonts w:hint="eastAsia"/>
-              </w:rPr>
             </w:pPr>
             <w:r>
               <w:rPr>
@@ -563,9 +632,6 @@
           <w:p>
             <w:pPr>
               <w:jc w:val="center"/>
-              <w:rPr>
-                <w:rFonts w:hint="eastAsia"/>
-              </w:rPr>
             </w:pPr>
             <w:r>
               <w:rPr>

</xml_diff>

<commit_message>
YHAAO-2264 support termination cause edit dialog and display
</commit_message>
<xml_diff>
--- a/src/src/main/webapp/portal/asset/template/tobeterminated_template.docx
+++ b/src/src/main/webapp/portal/asset/template/tobeterminated_template.docx
@@ -66,12 +66,12 @@
         <w:tblLook w:val="04A0" w:firstRow="1" w:lastRow="0" w:firstColumn="1" w:lastColumn="0" w:noHBand="0" w:noVBand="1"/>
       </w:tblPr>
       <w:tblGrid>
-        <w:gridCol w:w="1662"/>
-        <w:gridCol w:w="1427"/>
-        <w:gridCol w:w="1128"/>
-        <w:gridCol w:w="1391"/>
-        <w:gridCol w:w="1591"/>
-        <w:gridCol w:w="1436"/>
+        <w:gridCol w:w="1550"/>
+        <w:gridCol w:w="1293"/>
+        <w:gridCol w:w="966"/>
+        <w:gridCol w:w="2750"/>
+        <w:gridCol w:w="1472"/>
+        <w:gridCol w:w="1303"/>
       </w:tblGrid>
       <w:tr>
         <w:tc>
@@ -179,9 +179,6 @@
           <w:p>
             <w:pPr>
               <w:jc w:val="center"/>
-              <w:rPr>
-                <w:rFonts w:hint="eastAsia"/>
-              </w:rPr>
             </w:pPr>
             <w:proofErr w:type="spellStart"/>
             <w:r>
@@ -197,9 +194,6 @@
           <w:p>
             <w:pPr>
               <w:jc w:val="center"/>
-              <w:rPr>
-                <w:rFonts w:hint="eastAsia"/>
-              </w:rPr>
             </w:pPr>
             <w:proofErr w:type="spellStart"/>
             <w:r>
@@ -215,9 +209,6 @@
           <w:p>
             <w:pPr>
               <w:jc w:val="center"/>
-              <w:rPr>
-                <w:rFonts w:hint="eastAsia"/>
-              </w:rPr>
             </w:pPr>
             <w:r>
               <w:t>quantity</w:t>
@@ -231,9 +222,6 @@
           <w:p>
             <w:pPr>
               <w:jc w:val="center"/>
-              <w:rPr>
-                <w:rFonts w:hint="eastAsia"/>
-              </w:rPr>
             </w:pPr>
             <w:proofErr w:type="spellStart"/>
             <w:r>
@@ -249,9 +237,6 @@
           <w:p>
             <w:pPr>
               <w:jc w:val="center"/>
-              <w:rPr>
-                <w:rFonts w:hint="eastAsia"/>
-              </w:rPr>
             </w:pPr>
             <w:proofErr w:type="spellStart"/>
             <w:r>
@@ -267,18 +252,10 @@
           <w:p>
             <w:pPr>
               <w:jc w:val="center"/>
-              <w:rPr>
-                <w:rFonts w:hint="eastAsia"/>
-              </w:rPr>
             </w:pPr>
             <w:proofErr w:type="spellStart"/>
             <w:r>
-              <w:t>cre</w:t>
-            </w:r>
-            <w:bookmarkStart w:id="0" w:name="_GoBack"/>
-            <w:bookmarkEnd w:id="0"/>
-            <w:r>
-              <w:t>ate_time</w:t>
+              <w:t>create_time</w:t>
             </w:r>
             <w:proofErr w:type="spellEnd"/>
           </w:p>
@@ -368,6 +345,23 @@
             <w:pPr>
               <w:jc w:val="center"/>
             </w:pPr>
+            <w:r>
+              <w:rPr>
+                <w:rFonts w:hint="eastAsia"/>
+              </w:rPr>
+              <w:t>{{</w:t>
+            </w:r>
+            <w:proofErr w:type="spellStart"/>
+            <w:r>
+              <w:t>asset_department_name</w:t>
+            </w:r>
+            <w:proofErr w:type="spellEnd"/>
+            <w:r>
+              <w:rPr>
+                <w:rFonts w:hint="eastAsia"/>
+              </w:rPr>
+              <w:t>}}</w:t>
+            </w:r>
           </w:p>
         </w:tc>
         <w:tc>
@@ -455,9 +449,17 @@
             <w:gridSpan w:val="5"/>
           </w:tcPr>
           <w:p>
-            <w:pPr>
-              <w:jc w:val="center"/>
-            </w:pPr>
+            <w:r>
+              <w:t>{{</w:t>
+            </w:r>
+            <w:r>
+              <w:t>asset_termination_cause</w:t>
+            </w:r>
+            <w:bookmarkStart w:id="0" w:name="_GoBack"/>
+            <w:bookmarkEnd w:id="0"/>
+            <w:r>
+              <w:t>}}</w:t>
+            </w:r>
           </w:p>
         </w:tc>
       </w:tr>

</xml_diff>

<commit_message>
YHAAO-2264 update template support more asset fields
</commit_message>
<xml_diff>
--- a/src/src/main/webapp/portal/asset/template/tobeterminated_template.docx
+++ b/src/src/main/webapp/portal/asset/template/tobeterminated_template.docx
@@ -62,21 +62,21 @@
     <w:tbl>
       <w:tblPr>
         <w:tblStyle w:val="TableGrid"/>
-        <w:tblW w:w="8635" w:type="dxa"/>
+        <w:tblW w:w="8804" w:type="dxa"/>
         <w:tblLook w:val="04A0" w:firstRow="1" w:lastRow="0" w:firstColumn="1" w:lastColumn="0" w:noHBand="0" w:noVBand="1"/>
       </w:tblPr>
       <w:tblGrid>
         <w:gridCol w:w="1550"/>
         <w:gridCol w:w="1293"/>
-        <w:gridCol w:w="966"/>
+        <w:gridCol w:w="1112"/>
         <w:gridCol w:w="2750"/>
         <w:gridCol w:w="1472"/>
-        <w:gridCol w:w="1303"/>
+        <w:gridCol w:w="1262"/>
       </w:tblGrid>
       <w:tr>
         <w:tc>
           <w:tcPr>
-            <w:tcW w:w="2880" w:type="dxa"/>
+            <w:tcW w:w="1550" w:type="dxa"/>
           </w:tcPr>
           <w:p>
             <w:pPr>
@@ -92,7 +92,7 @@
         </w:tc>
         <w:tc>
           <w:tcPr>
-            <w:tcW w:w="2880" w:type="dxa"/>
+            <w:tcW w:w="1293" w:type="dxa"/>
           </w:tcPr>
           <w:p>
             <w:pPr>
@@ -108,7 +108,7 @@
         </w:tc>
         <w:tc>
           <w:tcPr>
-            <w:tcW w:w="2880" w:type="dxa"/>
+            <w:tcW w:w="1112" w:type="dxa"/>
           </w:tcPr>
           <w:p>
             <w:pPr>
@@ -124,7 +124,7 @@
         </w:tc>
         <w:tc>
           <w:tcPr>
-            <w:tcW w:w="2880" w:type="dxa"/>
+            <w:tcW w:w="2074" w:type="dxa"/>
           </w:tcPr>
           <w:p>
             <w:pPr>
@@ -140,7 +140,7 @@
         </w:tc>
         <w:tc>
           <w:tcPr>
-            <w:tcW w:w="2880" w:type="dxa"/>
+            <w:tcW w:w="1472" w:type="dxa"/>
           </w:tcPr>
           <w:p>
             <w:pPr>
@@ -156,7 +156,7 @@
         </w:tc>
         <w:tc>
           <w:tcPr>
-            <w:tcW w:w="2880" w:type="dxa"/>
+            <w:tcW w:w="1303" w:type="dxa"/>
           </w:tcPr>
           <w:p>
             <w:pPr>
@@ -174,7 +174,7 @@
       <w:tr>
         <w:tc>
           <w:tcPr>
-            <w:tcW w:w="2880" w:type="dxa"/>
+            <w:tcW w:w="1550" w:type="dxa"/>
           </w:tcPr>
           <w:p>
             <w:pPr>
@@ -189,7 +189,7 @@
         </w:tc>
         <w:tc>
           <w:tcPr>
-            <w:tcW w:w="2880" w:type="dxa"/>
+            <w:tcW w:w="1293" w:type="dxa"/>
           </w:tcPr>
           <w:p>
             <w:pPr>
@@ -204,20 +204,27 @@
         </w:tc>
         <w:tc>
           <w:tcPr>
-            <w:tcW w:w="2880" w:type="dxa"/>
-          </w:tcPr>
-          <w:p>
-            <w:pPr>
-              <w:jc w:val="center"/>
-            </w:pPr>
-            <w:r>
-              <w:t>quantity</w:t>
-            </w:r>
-          </w:p>
-        </w:tc>
-        <w:tc>
-          <w:tcPr>
-            <w:tcW w:w="2880" w:type="dxa"/>
+            <w:tcW w:w="1112" w:type="dxa"/>
+          </w:tcPr>
+          <w:p>
+            <w:pPr>
+              <w:jc w:val="center"/>
+            </w:pPr>
+          </w:p>
+        </w:tc>
+        <w:tc>
+          <w:tcPr>
+            <w:tcW w:w="2074" w:type="dxa"/>
+          </w:tcPr>
+          <w:p>
+            <w:pPr>
+              <w:jc w:val="center"/>
+            </w:pPr>
+          </w:p>
+        </w:tc>
+        <w:tc>
+          <w:tcPr>
+            <w:tcW w:w="1472" w:type="dxa"/>
           </w:tcPr>
           <w:p>
             <w:pPr>
@@ -225,46 +232,34 @@
             </w:pPr>
             <w:proofErr w:type="spellStart"/>
             <w:r>
-              <w:t>book_value</w:t>
+              <w:t>function_type</w:t>
             </w:r>
             <w:proofErr w:type="spellEnd"/>
           </w:p>
         </w:tc>
         <w:tc>
           <w:tcPr>
-            <w:tcW w:w="2880" w:type="dxa"/>
-          </w:tcPr>
-          <w:p>
-            <w:pPr>
-              <w:jc w:val="center"/>
-            </w:pPr>
-            <w:proofErr w:type="spellStart"/>
-            <w:r>
-              <w:t>function_type</w:t>
-            </w:r>
-            <w:proofErr w:type="spellEnd"/>
-          </w:p>
-        </w:tc>
-        <w:tc>
-          <w:tcPr>
-            <w:tcW w:w="2880" w:type="dxa"/>
-          </w:tcPr>
-          <w:p>
-            <w:pPr>
-              <w:jc w:val="center"/>
-            </w:pPr>
-            <w:proofErr w:type="spellStart"/>
-            <w:r>
-              <w:t>create_time</w:t>
-            </w:r>
-            <w:proofErr w:type="spellEnd"/>
+            <w:tcW w:w="1303" w:type="dxa"/>
+          </w:tcPr>
+          <w:p>
+            <w:pPr>
+              <w:jc w:val="center"/>
+            </w:pPr>
+            <w:r>
+              <w:t>i</w:t>
+            </w:r>
+            <w:bookmarkStart w:id="0" w:name="_GoBack"/>
+            <w:bookmarkEnd w:id="0"/>
+            <w:r>
+              <w:t>nstall_date</w:t>
+            </w:r>
           </w:p>
         </w:tc>
       </w:tr>
       <w:tr>
         <w:tc>
           <w:tcPr>
-            <w:tcW w:w="2880" w:type="dxa"/>
+            <w:tcW w:w="8804" w:type="dxa"/>
             <w:gridSpan w:val="6"/>
           </w:tcPr>
           <w:p>
@@ -295,9 +290,12 @@
         </w:tc>
       </w:tr>
       <w:tr>
-        <w:tc>
-          <w:tcPr>
-            <w:tcW w:w="2880" w:type="dxa"/>
+        <w:trPr>
+          <w:trHeight w:val="602"/>
+        </w:trPr>
+        <w:tc>
+          <w:tcPr>
+            <w:tcW w:w="1550" w:type="dxa"/>
           </w:tcPr>
           <w:p>
             <w:pPr>
@@ -313,17 +311,18 @@
         </w:tc>
         <w:tc>
           <w:tcPr>
-            <w:tcW w:w="2880" w:type="dxa"/>
-          </w:tcPr>
-          <w:p>
-            <w:pPr>
-              <w:jc w:val="center"/>
-            </w:pPr>
-          </w:p>
-        </w:tc>
-        <w:tc>
-          <w:tcPr>
-            <w:tcW w:w="2880" w:type="dxa"/>
+            <w:tcW w:w="1293" w:type="dxa"/>
+          </w:tcPr>
+          <w:p>
+            <w:pPr>
+              <w:jc w:val="center"/>
+            </w:pPr>
+          </w:p>
+        </w:tc>
+        <w:tc>
+          <w:tcPr>
+            <w:tcW w:w="1112" w:type="dxa"/>
+            <w:noWrap/>
           </w:tcPr>
           <w:p>
             <w:pPr>
@@ -339,7 +338,7 @@
         </w:tc>
         <w:tc>
           <w:tcPr>
-            <w:tcW w:w="2880" w:type="dxa"/>
+            <w:tcW w:w="2074" w:type="dxa"/>
           </w:tcPr>
           <w:p>
             <w:pPr>
@@ -366,7 +365,7 @@
         </w:tc>
         <w:tc>
           <w:tcPr>
-            <w:tcW w:w="2880" w:type="dxa"/>
+            <w:tcW w:w="1472" w:type="dxa"/>
           </w:tcPr>
           <w:p>
             <w:pPr>
@@ -382,7 +381,7 @@
         </w:tc>
         <w:tc>
           <w:tcPr>
-            <w:tcW w:w="2880" w:type="dxa"/>
+            <w:tcW w:w="1303" w:type="dxa"/>
           </w:tcPr>
           <w:p>
             <w:pPr>
@@ -397,7 +396,7 @@
         </w:trPr>
         <w:tc>
           <w:tcPr>
-            <w:tcW w:w="2880" w:type="dxa"/>
+            <w:tcW w:w="1550" w:type="dxa"/>
           </w:tcPr>
           <w:p>
             <w:pPr>
@@ -413,7 +412,7 @@
         </w:tc>
         <w:tc>
           <w:tcPr>
-            <w:tcW w:w="2880" w:type="dxa"/>
+            <w:tcW w:w="7254" w:type="dxa"/>
             <w:gridSpan w:val="5"/>
           </w:tcPr>
           <w:p>
@@ -429,7 +428,7 @@
         </w:trPr>
         <w:tc>
           <w:tcPr>
-            <w:tcW w:w="2880" w:type="dxa"/>
+            <w:tcW w:w="1550" w:type="dxa"/>
           </w:tcPr>
           <w:p>
             <w:pPr>
@@ -445,7 +444,7 @@
         </w:tc>
         <w:tc>
           <w:tcPr>
-            <w:tcW w:w="2880" w:type="dxa"/>
+            <w:tcW w:w="7254" w:type="dxa"/>
             <w:gridSpan w:val="5"/>
           </w:tcPr>
           <w:p>
@@ -455,8 +454,6 @@
             <w:r>
               <w:t>asset_termination_cause</w:t>
             </w:r>
-            <w:bookmarkStart w:id="0" w:name="_GoBack"/>
-            <w:bookmarkEnd w:id="0"/>
             <w:r>
               <w:t>}}</w:t>
             </w:r>
@@ -469,7 +466,7 @@
         </w:trPr>
         <w:tc>
           <w:tcPr>
-            <w:tcW w:w="2880" w:type="dxa"/>
+            <w:tcW w:w="1550" w:type="dxa"/>
           </w:tcPr>
           <w:p>
             <w:pPr>
@@ -485,7 +482,7 @@
         </w:tc>
         <w:tc>
           <w:tcPr>
-            <w:tcW w:w="2880" w:type="dxa"/>
+            <w:tcW w:w="7254" w:type="dxa"/>
             <w:gridSpan w:val="5"/>
           </w:tcPr>
           <w:p>
@@ -501,7 +498,7 @@
         </w:trPr>
         <w:tc>
           <w:tcPr>
-            <w:tcW w:w="2880" w:type="dxa"/>
+            <w:tcW w:w="1550" w:type="dxa"/>
           </w:tcPr>
           <w:p>
             <w:pPr>
@@ -517,7 +514,7 @@
         </w:tc>
         <w:tc>
           <w:tcPr>
-            <w:tcW w:w="2880" w:type="dxa"/>
+            <w:tcW w:w="7254" w:type="dxa"/>
             <w:gridSpan w:val="5"/>
           </w:tcPr>
           <w:p>
@@ -533,7 +530,7 @@
         </w:trPr>
         <w:tc>
           <w:tcPr>
-            <w:tcW w:w="2880" w:type="dxa"/>
+            <w:tcW w:w="1550" w:type="dxa"/>
           </w:tcPr>
           <w:p>
             <w:pPr>
@@ -549,7 +546,7 @@
         </w:tc>
         <w:tc>
           <w:tcPr>
-            <w:tcW w:w="2880" w:type="dxa"/>
+            <w:tcW w:w="7254" w:type="dxa"/>
             <w:gridSpan w:val="5"/>
           </w:tcPr>
           <w:p>
@@ -565,7 +562,7 @@
         </w:trPr>
         <w:tc>
           <w:tcPr>
-            <w:tcW w:w="2880" w:type="dxa"/>
+            <w:tcW w:w="1550" w:type="dxa"/>
           </w:tcPr>
           <w:p>
             <w:pPr>
@@ -581,7 +578,7 @@
         </w:tc>
         <w:tc>
           <w:tcPr>
-            <w:tcW w:w="2880" w:type="dxa"/>
+            <w:tcW w:w="7254" w:type="dxa"/>
             <w:gridSpan w:val="5"/>
           </w:tcPr>
           <w:p>
@@ -597,7 +594,7 @@
         </w:trPr>
         <w:tc>
           <w:tcPr>
-            <w:tcW w:w="2880" w:type="dxa"/>
+            <w:tcW w:w="1550" w:type="dxa"/>
           </w:tcPr>
           <w:p>
             <w:pPr>
@@ -613,7 +610,7 @@
         </w:tc>
         <w:tc>
           <w:tcPr>
-            <w:tcW w:w="2880" w:type="dxa"/>
+            <w:tcW w:w="7254" w:type="dxa"/>
             <w:gridSpan w:val="5"/>
           </w:tcPr>
           <w:p>
@@ -629,7 +626,7 @@
         </w:trPr>
         <w:tc>
           <w:tcPr>
-            <w:tcW w:w="2880" w:type="dxa"/>
+            <w:tcW w:w="1550" w:type="dxa"/>
           </w:tcPr>
           <w:p>
             <w:pPr>
@@ -645,7 +642,7 @@
         </w:tc>
         <w:tc>
           <w:tcPr>
-            <w:tcW w:w="2880" w:type="dxa"/>
+            <w:tcW w:w="7254" w:type="dxa"/>
             <w:gridSpan w:val="5"/>
           </w:tcPr>
           <w:p>

</xml_diff>